<commit_message>
Regenerate showcase downloads against the unified API
</commit_message>
<xml_diff>
--- a/Website/static/downloads/showcase/workflows/word-business-case/example.docx
+++ b/Website/static/downloads/showcase/workflows/word-business-case/example.docx
@@ -10,9 +10,8 @@
       </w:pPr>
       <w:r>
         <w:rPr>
-          <w:rFonts w:ascii="Carlito" w:hAnsi="Carlito" w:eastAsia="Carlito" w:cs="Carlito"/>
-          <w:b/>
-          <w:bCs/>
+          <w:b w:val="true"/>
+          <w:bCs w:val="true"/>
           <w:color w:val="17365D"/>
           <w:sz w:val="52"/>
         </w:rPr>
@@ -25,7 +24,6 @@
       </w:pPr>
       <w:r>
         <w:rPr>
-          <w:rFonts w:ascii="Carlito" w:hAnsi="Carlito" w:eastAsia="Carlito" w:cs="Carlito"/>
           <w:sz w:val="22"/>
         </w:rPr>
         <w:t xml:space="preserve">NORTHWIND / INVESTMENT REVIEW / ILLUSTRATIVE ESTIMATE</w:t>
@@ -37,7 +35,6 @@
       </w:pPr>
       <w:r>
         <w:rPr>
-          <w:rFonts w:ascii="Carlito" w:hAnsi="Carlito" w:eastAsia="Carlito" w:cs="Carlito"/>
           <w:sz w:val="22"/>
         </w:rPr>
         <w:t xml:space="preserve">Decide whether a shared intake form is worth a six-week pilot. The baseline is 240 requests per month; every amount below is an estimate.</w:t>
@@ -51,9 +48,8 @@
       </w:pPr>
       <w:r>
         <w:rPr>
-          <w:rFonts w:ascii="Carlito" w:hAnsi="Carlito" w:eastAsia="Carlito" w:cs="Carlito"/>
-          <w:b/>
-          <w:bCs/>
+          <w:b w:val="true"/>
+          <w:bCs w:val="true"/>
           <w:color w:val="17365D"/>
           <w:sz w:val="30"/>
         </w:rPr>
@@ -91,9 +87,8 @@
             </w:pPr>
             <w:r>
               <w:rPr>
-                <w:rFonts w:ascii="Carlito" w:hAnsi="Carlito" w:eastAsia="Carlito" w:cs="Carlito"/>
-                <w:b/>
-                <w:bCs/>
+                <w:b w:val="true"/>
+                <w:bCs w:val="true"/>
                 <w:color w:val="FFFFFF"/>
                 <w:sz w:val="20"/>
               </w:rPr>
@@ -118,9 +113,8 @@
             </w:pPr>
             <w:r>
               <w:rPr>
-                <w:rFonts w:ascii="Carlito" w:hAnsi="Carlito" w:eastAsia="Carlito" w:cs="Carlito"/>
-                <w:b/>
-                <w:bCs/>
+                <w:b w:val="true"/>
+                <w:bCs w:val="true"/>
                 <w:color w:val="FFFFFF"/>
                 <w:sz w:val="20"/>
               </w:rPr>
@@ -145,9 +139,8 @@
             </w:pPr>
             <w:r>
               <w:rPr>
-                <w:rFonts w:ascii="Carlito" w:hAnsi="Carlito" w:eastAsia="Carlito" w:cs="Carlito"/>
-                <w:b/>
-                <w:bCs/>
+                <w:b w:val="true"/>
+                <w:bCs w:val="true"/>
                 <w:color w:val="FFFFFF"/>
                 <w:sz w:val="20"/>
               </w:rPr>
@@ -172,9 +165,8 @@
             </w:pPr>
             <w:r>
               <w:rPr>
-                <w:rFonts w:ascii="Carlito" w:hAnsi="Carlito" w:eastAsia="Carlito" w:cs="Carlito"/>
-                <w:b/>
-                <w:bCs/>
+                <w:b w:val="true"/>
+                <w:bCs w:val="true"/>
                 <w:color w:val="FFFFFF"/>
                 <w:sz w:val="20"/>
               </w:rPr>
@@ -201,7 +193,8 @@
             </w:pPr>
             <w:r>
               <w:rPr>
-                <w:rFonts w:ascii="Carlito" w:hAnsi="Carlito" w:eastAsia="Carlito" w:cs="Carlito"/>
+                <w:b w:val="false"/>
+                <w:bCs w:val="false"/>
                 <w:color w:val="243247"/>
                 <w:sz w:val="20"/>
               </w:rPr>
@@ -226,7 +219,8 @@
             </w:pPr>
             <w:r>
               <w:rPr>
-                <w:rFonts w:ascii="Carlito" w:hAnsi="Carlito" w:eastAsia="Carlito" w:cs="Carlito"/>
+                <w:b w:val="false"/>
+                <w:bCs w:val="false"/>
                 <w:color w:val="243247"/>
                 <w:sz w:val="20"/>
               </w:rPr>
@@ -251,7 +245,8 @@
             </w:pPr>
             <w:r>
               <w:rPr>
-                <w:rFonts w:ascii="Carlito" w:hAnsi="Carlito" w:eastAsia="Carlito" w:cs="Carlito"/>
+                <w:b w:val="false"/>
+                <w:bCs w:val="false"/>
                 <w:color w:val="243247"/>
                 <w:sz w:val="20"/>
               </w:rPr>
@@ -276,7 +271,8 @@
             </w:pPr>
             <w:r>
               <w:rPr>
-                <w:rFonts w:ascii="Carlito" w:hAnsi="Carlito" w:eastAsia="Carlito" w:cs="Carlito"/>
+                <w:b w:val="false"/>
+                <w:bCs w:val="false"/>
                 <w:color w:val="243247"/>
                 <w:sz w:val="20"/>
               </w:rPr>
@@ -303,7 +299,8 @@
             </w:pPr>
             <w:r>
               <w:rPr>
-                <w:rFonts w:ascii="Carlito" w:hAnsi="Carlito" w:eastAsia="Carlito" w:cs="Carlito"/>
+                <w:b w:val="false"/>
+                <w:bCs w:val="false"/>
                 <w:color w:val="243247"/>
                 <w:sz w:val="20"/>
               </w:rPr>
@@ -328,7 +325,8 @@
             </w:pPr>
             <w:r>
               <w:rPr>
-                <w:rFonts w:ascii="Carlito" w:hAnsi="Carlito" w:eastAsia="Carlito" w:cs="Carlito"/>
+                <w:b w:val="false"/>
+                <w:bCs w:val="false"/>
                 <w:color w:val="243247"/>
                 <w:sz w:val="20"/>
               </w:rPr>
@@ -353,7 +351,8 @@
             </w:pPr>
             <w:r>
               <w:rPr>
-                <w:rFonts w:ascii="Carlito" w:hAnsi="Carlito" w:eastAsia="Carlito" w:cs="Carlito"/>
+                <w:b w:val="false"/>
+                <w:bCs w:val="false"/>
                 <w:color w:val="243247"/>
                 <w:sz w:val="20"/>
               </w:rPr>
@@ -378,7 +377,8 @@
             </w:pPr>
             <w:r>
               <w:rPr>
-                <w:rFonts w:ascii="Carlito" w:hAnsi="Carlito" w:eastAsia="Carlito" w:cs="Carlito"/>
+                <w:b w:val="false"/>
+                <w:bCs w:val="false"/>
                 <w:color w:val="243247"/>
                 <w:sz w:val="20"/>
               </w:rPr>
@@ -405,7 +405,8 @@
             </w:pPr>
             <w:r>
               <w:rPr>
-                <w:rFonts w:ascii="Carlito" w:hAnsi="Carlito" w:eastAsia="Carlito" w:cs="Carlito"/>
+                <w:b w:val="false"/>
+                <w:bCs w:val="false"/>
                 <w:color w:val="243247"/>
                 <w:sz w:val="20"/>
               </w:rPr>
@@ -430,7 +431,8 @@
             </w:pPr>
             <w:r>
               <w:rPr>
-                <w:rFonts w:ascii="Carlito" w:hAnsi="Carlito" w:eastAsia="Carlito" w:cs="Carlito"/>
+                <w:b w:val="false"/>
+                <w:bCs w:val="false"/>
                 <w:color w:val="243247"/>
                 <w:sz w:val="20"/>
               </w:rPr>
@@ -455,7 +457,8 @@
             </w:pPr>
             <w:r>
               <w:rPr>
-                <w:rFonts w:ascii="Carlito" w:hAnsi="Carlito" w:eastAsia="Carlito" w:cs="Carlito"/>
+                <w:b w:val="false"/>
+                <w:bCs w:val="false"/>
                 <w:color w:val="243247"/>
                 <w:sz w:val="20"/>
               </w:rPr>
@@ -480,7 +483,8 @@
             </w:pPr>
             <w:r>
               <w:rPr>
-                <w:rFonts w:ascii="Carlito" w:hAnsi="Carlito" w:eastAsia="Carlito" w:cs="Carlito"/>
+                <w:b w:val="false"/>
+                <w:bCs w:val="false"/>
                 <w:color w:val="243247"/>
                 <w:sz w:val="20"/>
               </w:rPr>
@@ -498,9 +502,8 @@
       </w:pPr>
       <w:r>
         <w:rPr>
-          <w:rFonts w:ascii="Carlito" w:hAnsi="Carlito" w:eastAsia="Carlito" w:cs="Carlito"/>
-          <w:b/>
-          <w:bCs/>
+          <w:b w:val="true"/>
+          <w:bCs w:val="true"/>
           <w:color w:val="17365D"/>
           <w:sz w:val="30"/>
         </w:rPr>
@@ -513,7 +516,6 @@
       </w:pPr>
       <w:r>
         <w:rPr>
-          <w:rFonts w:ascii="Carlito" w:hAnsi="Carlito" w:eastAsia="Carlito" w:cs="Carlito"/>
           <w:sz w:val="22"/>
         </w:rPr>
         <w:t xml:space="preserve">Pilot the existing-form improvement first. At the estimated saving, simple payback is about seven months; at half the saving it is about fourteen. This excludes tax, financing and ongoing support cost.</w:t>
@@ -527,9 +529,8 @@
       </w:pPr>
       <w:r>
         <w:rPr>
-          <w:rFonts w:ascii="Carlito" w:hAnsi="Carlito" w:eastAsia="Carlito" w:cs="Carlito"/>
-          <w:b/>
-          <w:bCs/>
+          <w:b w:val="true"/>
+          <w:bCs w:val="true"/>
           <w:color w:val="17365D"/>
           <w:sz w:val="30"/>
         </w:rPr>
@@ -547,7 +548,6 @@
       </w:pPr>
       <w:r>
         <w:rPr>
-          <w:rFonts w:ascii="Carlito" w:hAnsi="Carlito" w:eastAsia="Carlito" w:cs="Carlito"/>
           <w:sz w:val="22"/>
         </w:rPr>
         <w:t xml:space="preserve">Finance: replace estimates with a full cost model.</w:t>
@@ -564,7 +564,6 @@
       </w:pPr>
       <w:r>
         <w:rPr>
-          <w:rFonts w:ascii="Carlito" w:hAnsi="Carlito" w:eastAsia="Carlito" w:cs="Carlito"/>
           <w:sz w:val="22"/>
         </w:rPr>
         <w:t xml:space="preserve">Operations: measure triage time before and during the pilot.</w:t>
@@ -581,13 +580,14 @@
       </w:pPr>
       <w:r>
         <w:rPr>
-          <w:rFonts w:ascii="Carlito" w:hAnsi="Carlito" w:eastAsia="Carlito" w:cs="Carlito"/>
           <w:sz w:val="22"/>
         </w:rPr>
         <w:t xml:space="preserve">Sponsor: review results before committing to a wider rollout.</w:t>
       </w:r>
     </w:p>
     <w:sectPr>
+      <w:headerReference w:type="default" r:id="Re29791c65fc94d35"/>
+      <w:footerReference w:type="default" r:id="Rf9ea9bf4b2134e1e"/>
       <w:pgSz w:w="12240" w:h="15840" w:code="1"/>
       <w:pgMar w:top="1440" w:right="1440" w:bottom="1440" w:left="1440" w:header="720" w:footer="720" w:gutter="0"/>
     </w:sectPr>
@@ -597,6 +597,66 @@
 
 <file path=word/endnotes.xml><?xml version="1.0" encoding="utf-8"?>
 <w:endnotes xmlns:wpc="http://schemas.microsoft.com/office/word/2010/wordprocessingCanvas" xmlns:cx="http://schemas.microsoft.com/office/drawing/2014/chartex" xmlns:cx1="http://schemas.microsoft.com/office/drawing/2015/9/8/chartex" xmlns:cx2="http://schemas.microsoft.com/office/drawing/2015/10/21/chartex" xmlns:cx3="http://schemas.microsoft.com/office/drawing/2016/5/9/chartex" xmlns:cx4="http://schemas.microsoft.com/office/drawing/2016/5/10/chartex" xmlns:cx5="http://schemas.microsoft.com/office/drawing/2016/5/11/chartex" xmlns:cx6="http://schemas.microsoft.com/office/drawing/2016/5/12/chartex" xmlns:cx7="http://schemas.microsoft.com/office/drawing/2016/5/13/chartex" xmlns:cx8="http://schemas.microsoft.com/office/drawing/2016/5/14/chartex" xmlns:mc="http://schemas.openxmlformats.org/markup-compatibility/2006" xmlns:aink="http://schemas.microsoft.com/office/drawing/2016/ink" xmlns:am3d="http://schemas.microsoft.com/office/drawing/2017/model3d" xmlns:o="urn:schemas-microsoft-com:office:office" xmlns:oel="http://schemas.microsoft.com/office/2019/extlst" xmlns:r="http://schemas.openxmlformats.org/officeDocument/2006/relationships" xmlns:m="http://schemas.openxmlformats.org/officeDocument/2006/math" xmlns:v="urn:schemas-microsoft-com:vml" xmlns:wp14="http://schemas.microsoft.com/office/word/2010/wordprocessingDrawing" xmlns:wp="http://schemas.openxmlformats.org/drawingml/2006/wordprocessingDrawing" xmlns:w10="urn:schemas-microsoft-com:office:word" xmlns:w="http://schemas.openxmlformats.org/wordprocessingml/2006/main" xmlns:w14="http://schemas.microsoft.com/office/word/2010/wordml" xmlns:w15="http://schemas.microsoft.com/office/word/2012/wordml" xmlns:w16cex="http://schemas.microsoft.com/office/word/2018/wordml/cex" xmlns:w16cid="http://schemas.microsoft.com/office/word/2016/wordml/cid" xmlns:w16="http://schemas.microsoft.com/office/word/2018/wordml" xmlns:w16sdtdh="http://schemas.microsoft.com/office/word/2020/wordml/sdtdatahash" xmlns:w16se="http://schemas.microsoft.com/office/word/2015/wordml/symex" xmlns:wpg="http://schemas.microsoft.com/office/word/2010/wordprocessingGroup" xmlns:wpi="http://schemas.microsoft.com/office/word/2010/wordprocessingInk" xmlns:wne="http://schemas.microsoft.com/office/word/2006/wordml" xmlns:wps="http://schemas.microsoft.com/office/word/2010/wordprocessingShape" mc:Ignorable="w14 w15 w16se w16cid w16 w16cex w16sdtdh wp14"/>
+</file>
+
+<file path=word/footer1.xml><?xml version="1.0" encoding="utf-8"?>
+<w:ftr xmlns:w="http://schemas.openxmlformats.org/wordprocessingml/2006/main">
+  <w:p>
+    <w:pPr>
+      <w:tabs>
+        <w:tab w:val="right" w:leader="none" w:pos="9360"/>
+      </w:tabs>
+    </w:pPr>
+    <w:r>
+      <w:rPr>
+        <w:color w:val="5B6575"/>
+        <w:sz w:val="18"/>
+      </w:rPr>
+      <w:t xml:space="preserve">Business case: service intake</w:t>
+    </w:r>
+    <w:r>
+      <w:rPr>
+        <w:color w:val="5B6575"/>
+        <w:sz w:val="18"/>
+      </w:rPr>
+      <w:tab/>
+    </w:r>
+    <w:r>
+      <w:rPr>
+        <w:color w:val="5B6575"/>
+        <w:sz w:val="18"/>
+      </w:rPr>
+      <w:t xml:space="preserve">Internal · Page </w:t>
+    </w:r>
+    <w:fldSimple w:instr=" PAGE  \* MERGEFORMAT " w:dirty="true">
+      <w:r>
+        <w:rPr>
+          <w:noProof/>
+          <w:color w:val="5B6575"/>
+          <w:sz w:val="18"/>
+        </w:rPr>
+        <w:t>[Document Page]</w:t>
+      </w:r>
+    </w:fldSimple>
+    <w:r>
+      <w:rPr>
+        <w:color w:val="5B6575"/>
+        <w:sz w:val="18"/>
+      </w:rPr>
+      <w:t xml:space="preserve"> of </w:t>
+    </w:r>
+    <w:fldSimple w:instr=" NUMPAGES  \* MERGEFORMAT " w:dirty="true">
+      <w:r>
+        <w:rPr>
+          <w:noProof/>
+          <w:color w:val="5B6575"/>
+          <w:sz w:val="18"/>
+        </w:rPr>
+        <w:t>[Document NumPages]</w:t>
+      </w:r>
+    </w:fldSimple>
+  </w:p>
+</w:ftr>
 </file>
 
 <file path=word/footnotes.xml><?xml version="1.0" encoding="utf-8"?>
@@ -624,10 +684,14 @@
 </w:footnotes>
 </file>
 
+<file path=word/header1.xml><?xml version="1.0" encoding="utf-8"?>
+<w:hdr xmlns:w="http://schemas.openxmlformats.org/wordprocessingml/2006/main"/>
+</file>
+
 <file path=word/numbering.xml><?xml version="1.0" encoding="utf-8"?>
 <w:numbering xmlns:wpc="http://schemas.microsoft.com/office/word/2010/wordprocessingCanvas" xmlns:cx="http://schemas.microsoft.com/office/drawing/2014/chartex" xmlns:cx1="http://schemas.microsoft.com/office/drawing/2015/9/8/chartex" xmlns:cx2="http://schemas.microsoft.com/office/drawing/2015/10/21/chartex" xmlns:cx3="http://schemas.microsoft.com/office/drawing/2016/5/9/chartex" xmlns:cx4="http://schemas.microsoft.com/office/drawing/2016/5/10/chartex" xmlns:cx5="http://schemas.microsoft.com/office/drawing/2016/5/11/chartex" xmlns:cx6="http://schemas.microsoft.com/office/drawing/2016/5/12/chartex" xmlns:cx7="http://schemas.microsoft.com/office/drawing/2016/5/13/chartex" xmlns:cx8="http://schemas.microsoft.com/office/drawing/2016/5/14/chartex" xmlns:mc="http://schemas.openxmlformats.org/markup-compatibility/2006" xmlns:aink="http://schemas.microsoft.com/office/drawing/2016/ink" xmlns:am3d="http://schemas.microsoft.com/office/drawing/2017/model3d" xmlns:o="urn:schemas-microsoft-com:office:office" xmlns:oel="http://schemas.microsoft.com/office/2019/extlst" xmlns:r="http://schemas.openxmlformats.org/officeDocument/2006/relationships" xmlns:m="http://schemas.openxmlformats.org/officeDocument/2006/math" xmlns:v="urn:schemas-microsoft-com:vml" xmlns:wp14="http://schemas.microsoft.com/office/word/2010/wordprocessingDrawing" xmlns:wp="http://schemas.openxmlformats.org/drawingml/2006/wordprocessingDrawing" xmlns:w10="urn:schemas-microsoft-com:office:word" xmlns:w="http://schemas.openxmlformats.org/wordprocessingml/2006/main" xmlns:w14="http://schemas.microsoft.com/office/word/2010/wordml" xmlns:w15="http://schemas.microsoft.com/office/word/2012/wordml" xmlns:w16cex="http://schemas.microsoft.com/office/word/2018/wordml/cex" xmlns:w16cid="http://schemas.microsoft.com/office/word/2016/wordml/cid" xmlns:w16="http://schemas.microsoft.com/office/word/2018/wordml" xmlns:w16sdtdh="http://schemas.microsoft.com/office/word/2020/wordml/sdtdatahash" xmlns:w16se="http://schemas.microsoft.com/office/word/2015/wordml/symex" xmlns:wpg="http://schemas.microsoft.com/office/word/2010/wordprocessingGroup" xmlns:wpi="http://schemas.microsoft.com/office/word/2010/wordprocessingInk" xmlns:wne="http://schemas.microsoft.com/office/word/2006/wordml" xmlns:wps="http://schemas.microsoft.com/office/word/2010/wordprocessingShape" mc:Ignorable="w14 w15 w16se w16cid w16 w16cex w16sdtdh wp14">
   <w:abstractNum w:abstractNumId="0" w15:restartNumberingAfterBreak="0">
-    <w:nsid w:val="B320E252"/>
+    <w:nsid w:val="2ABF6010"/>
     <w:multiLevelType w:val="hybridMultilevel"/>
     <w:tmpl w:val="934E79A6"/>
     <w:lvl w:ilvl="0" w:tplc="04090001">
@@ -750,7 +814,7 @@
   <w:docDefaults>
     <w:rPrDefault>
       <w:rPr>
-        <w:rFonts w:ascii="Carlito" w:hAnsi="Carlito" w:eastAsia="Carlito" w:cs="Carlito"/>
+        <w:rFonts w:asciiTheme="minorHAnsi" w:hAnsiTheme="minorHAnsi" w:eastAsiaTheme="minorHAnsi" w:cstheme="minorBidi"/>
         <w:sz w:val="22"/>
         <w:szCs w:val="22"/>
         <w:lang w:val="en-US" w:eastAsia="en-US" w:bidi="ar-SA"/>
@@ -10672,6 +10736,57 @@
       </w:tcPr>
     </w:tblStylePr>
   </w:style>
+  <w:style w:type="table" w:styleId="OfficeIMOModern">
+    <w:name w:val="OfficeIMO Modern"/>
+    <w:basedOn w:val="TableNormal"/>
+    <w:uiPriority w:val="40"/>
+    <w:pPr>
+      <w:spacing w:before="0" w:after="0" w:line="240" w:lineRule="auto"/>
+    </w:pPr>
+    <w:rPr>
+      <w:color w:val="1B2433"/>
+      <w:sz w:val="20"/>
+      <w:szCs w:val="20"/>
+    </w:rPr>
+    <w:tblPr>
+      <w:tblStyleRowBandSize w:val="1"/>
+      <w:tblStyleColBandSize w:val="1"/>
+      <w:tblBorders>
+        <w:bottom w:val="single" w:color="DCE2EA" w:sz="4" w:space="0"/>
+        <w:insideH w:val="single" w:color="DCE2EA" w:sz="4" w:space="0"/>
+      </w:tblBorders>
+      <w:tblCellMar>
+        <w:top w:w="100" w:type="dxa"/>
+        <w:left w:w="140" w:type="dxa"/>
+        <w:bottom w:w="100" w:type="dxa"/>
+        <w:right w:w="140" w:type="dxa"/>
+      </w:tblCellMar>
+    </w:tblPr>
+    <w:tblStylePr w:type="firstRow">
+      <w:pPr>
+        <w:keepNext/>
+      </w:pPr>
+      <w:rPr>
+        <w:b w:val="true"/>
+        <w:bCs w:val="true"/>
+        <w:color w:val="1B2433"/>
+      </w:rPr>
+      <w:trPr>
+        <w:tblHeader/>
+      </w:trPr>
+      <w:tcPr>
+        <w:tcBorders>
+          <w:bottom w:val="single" w:color="3F64D7" w:sz="8" w:space="0"/>
+        </w:tcBorders>
+        <w:shd w:val="clear" w:color="auto" w:fill="EAF0FC"/>
+      </w:tcPr>
+    </w:tblStylePr>
+    <w:tblStylePr w:type="band2Horz">
+      <w:tcPr>
+        <w:shd w:val="clear" w:color="auto" w:fill="F6F8FB"/>
+      </w:tcPr>
+    </w:tblStylePr>
+  </w:style>
   <w:style w:type="paragraph" w:styleId="Normal" w:default="true">
     <w:name w:val="Normal"/>
     <w:qFormat/>
@@ -10683,18 +10798,19 @@
     <w:link w:val="Heading1Char"/>
     <w:uiPriority w:val="9"/>
     <w:qFormat/>
-    <w:rsid w:val="00973C6F"/>
     <w:pPr>
       <w:keepNext/>
       <w:keepLines/>
-      <w:spacing w:before="240" w:after="0"/>
+      <w:spacing w:before="360" w:after="120"/>
       <w:outlineLvl w:val="0"/>
     </w:pPr>
     <w:rPr>
-      <w:rFonts w:asciiTheme="majorHAnsi" w:hAnsiTheme="majorHAnsi" w:eastAsiaTheme="majorEastAsia" w:cstheme="majorBidi"/>
-      <w:color w:val="2F5496" w:themeColor="accent1" w:themeShade="BF"/>
-      <w:sz w:val="32"/>
-      <w:szCs w:val="32"/>
+      <w:rFonts w:asciiTheme="minorHAnsi" w:hAnsiTheme="minorHAnsi" w:eastAsiaTheme="minorEastAsia" w:cstheme="minorBidi"/>
+      <w:b/>
+      <w:bCs/>
+      <w:color w:val="1B2433"/>
+      <w:sz w:val="40"/>
+      <w:szCs w:val="40"/>
     </w:rPr>
   </w:style>
   <w:style w:type="paragraph" w:styleId="Heading2">
@@ -10704,19 +10820,19 @@
     <w:link w:val="Heading2Char"/>
     <w:uiPriority w:val="9"/>
     <w:unhideWhenUsed/>
-    <w:qFormat/>
-    <w:rsid w:val="00973C6F"/>
     <w:pPr>
       <w:keepNext/>
       <w:keepLines/>
-      <w:spacing w:before="40" w:after="0"/>
+      <w:spacing w:before="280" w:after="80"/>
       <w:outlineLvl w:val="1"/>
     </w:pPr>
     <w:rPr>
-      <w:rFonts w:asciiTheme="majorHAnsi" w:hAnsiTheme="majorHAnsi" w:eastAsiaTheme="majorEastAsia" w:cstheme="majorBidi"/>
-      <w:color w:val="2F5496" w:themeColor="accent1" w:themeShade="BF"/>
-      <w:sz w:val="26"/>
-      <w:szCs w:val="26"/>
+      <w:rFonts w:asciiTheme="minorHAnsi" w:hAnsiTheme="minorHAnsi" w:eastAsiaTheme="minorEastAsia" w:cstheme="minorBidi"/>
+      <w:b/>
+      <w:bCs/>
+      <w:color w:val="1B2433"/>
+      <w:sz w:val="30"/>
+      <w:szCs w:val="30"/>
     </w:rPr>
   </w:style>
   <w:style w:type="paragraph" w:styleId="Heading3">
@@ -10725,21 +10841,20 @@
     <w:next w:val="Normal"/>
     <w:link w:val="Heading3Char"/>
     <w:uiPriority w:val="9"/>
-    <w:semiHidden/>
     <w:unhideWhenUsed/>
-    <w:qFormat/>
-    <w:rsid w:val="00700ED2"/>
     <w:pPr>
       <w:keepNext/>
       <w:keepLines/>
-      <w:spacing w:before="40" w:after="0"/>
+      <w:spacing w:before="240" w:after="60"/>
       <w:outlineLvl w:val="2"/>
     </w:pPr>
     <w:rPr>
-      <w:rFonts w:asciiTheme="majorHAnsi" w:hAnsiTheme="majorHAnsi" w:eastAsiaTheme="majorEastAsia" w:cstheme="majorBidi"/>
-      <w:color w:val="1F3763" w:themeColor="accent1" w:themeShade="7F"/>
-      <w:sz w:val="24"/>
-      <w:szCs w:val="24"/>
+      <w:rFonts w:asciiTheme="minorHAnsi" w:hAnsiTheme="minorHAnsi" w:eastAsiaTheme="minorEastAsia" w:cstheme="minorBidi"/>
+      <w:b/>
+      <w:bCs/>
+      <w:color w:val="1B2433"/>
+      <w:sz w:val="25"/>
+      <w:szCs w:val="25"/>
     </w:rPr>
   </w:style>
   <w:style w:type="paragraph" w:styleId="Heading4">
@@ -10748,21 +10863,20 @@
     <w:next w:val="Normal"/>
     <w:link w:val="Heading4Char"/>
     <w:uiPriority w:val="9"/>
-    <w:semiHidden/>
     <w:unhideWhenUsed/>
-    <w:qFormat/>
-    <w:rsid w:val="00700ED2"/>
     <w:pPr>
       <w:keepNext/>
       <w:keepLines/>
-      <w:spacing w:before="40" w:after="0"/>
+      <w:spacing w:before="240" w:after="60"/>
       <w:outlineLvl w:val="3"/>
     </w:pPr>
     <w:rPr>
-      <w:rFonts w:asciiTheme="majorHAnsi" w:hAnsiTheme="majorHAnsi" w:eastAsiaTheme="majorEastAsia" w:cstheme="majorBidi"/>
-      <w:i/>
-      <w:iCs/>
-      <w:color w:val="2F5496" w:themeColor="accent1" w:themeShade="BF"/>
+      <w:rFonts w:asciiTheme="minorHAnsi" w:hAnsiTheme="minorHAnsi" w:eastAsiaTheme="minorEastAsia" w:cstheme="minorBidi"/>
+      <w:b/>
+      <w:bCs/>
+      <w:color w:val="1B2433"/>
+      <w:sz w:val="22"/>
+      <w:szCs w:val="22"/>
     </w:rPr>
   </w:style>
   <w:style w:type="paragraph" w:styleId="Heading5">
@@ -10771,19 +10885,20 @@
     <w:next w:val="Normal"/>
     <w:link w:val="Heading5Char"/>
     <w:uiPriority w:val="9"/>
-    <w:semiHidden/>
     <w:unhideWhenUsed/>
-    <w:qFormat/>
-    <w:rsid w:val="00700ED2"/>
     <w:pPr>
       <w:keepNext/>
       <w:keepLines/>
-      <w:spacing w:before="40" w:after="0"/>
+      <w:spacing w:before="240" w:after="60"/>
       <w:outlineLvl w:val="4"/>
     </w:pPr>
     <w:rPr>
-      <w:rFonts w:asciiTheme="majorHAnsi" w:hAnsiTheme="majorHAnsi" w:eastAsiaTheme="majorEastAsia" w:cstheme="majorBidi"/>
-      <w:color w:val="2F5496" w:themeColor="accent1" w:themeShade="BF"/>
+      <w:rFonts w:asciiTheme="minorHAnsi" w:hAnsiTheme="minorHAnsi" w:eastAsiaTheme="minorEastAsia" w:cstheme="minorBidi"/>
+      <w:b/>
+      <w:bCs/>
+      <w:color w:val="1B2433"/>
+      <w:sz w:val="22"/>
+      <w:szCs w:val="22"/>
     </w:rPr>
   </w:style>
   <w:style w:type="paragraph" w:styleId="Heading6">
@@ -10792,19 +10907,20 @@
     <w:next w:val="Normal"/>
     <w:link w:val="Heading6Char"/>
     <w:uiPriority w:val="9"/>
-    <w:semiHidden/>
     <w:unhideWhenUsed/>
-    <w:qFormat/>
-    <w:rsid w:val="00700ED2"/>
     <w:pPr>
       <w:keepNext/>
       <w:keepLines/>
-      <w:spacing w:before="40" w:after="0"/>
+      <w:spacing w:before="240" w:after="60"/>
       <w:outlineLvl w:val="5"/>
     </w:pPr>
     <w:rPr>
-      <w:rFonts w:asciiTheme="majorHAnsi" w:hAnsiTheme="majorHAnsi" w:eastAsiaTheme="majorEastAsia" w:cstheme="majorBidi"/>
-      <w:color w:val="1F3763" w:themeColor="accent1" w:themeShade="7F"/>
+      <w:rFonts w:asciiTheme="minorHAnsi" w:hAnsiTheme="minorHAnsi" w:eastAsiaTheme="minorEastAsia" w:cstheme="minorBidi"/>
+      <w:b/>
+      <w:bCs/>
+      <w:color w:val="1B2433"/>
+      <w:sz w:val="20"/>
+      <w:szCs w:val="20"/>
     </w:rPr>
   </w:style>
   <w:style w:type="paragraph" w:styleId="Heading7">
@@ -10889,6 +11005,43 @@
       <w:contextualSpacing/>
     </w:pPr>
   </w:style>
+  <w:style w:type="paragraph" w:styleId="Title">
+    <w:name w:val="Title"/>
+    <w:basedOn w:val="Normal"/>
+    <w:next w:val="Normal"/>
+    <w:uiPriority w:val="10"/>
+    <w:qFormat/>
+    <w:pPr>
+      <w:keepNext/>
+      <w:spacing w:before="0" w:after="120" w:line="240" w:lineRule="auto"/>
+      <w:contextualSpacing/>
+    </w:pPr>
+    <w:rPr>
+      <w:rFonts w:asciiTheme="minorHAnsi" w:hAnsiTheme="minorHAnsi" w:eastAsiaTheme="minorEastAsia" w:cstheme="minorBidi"/>
+      <w:b/>
+      <w:bCs/>
+      <w:color w:val="1B2433"/>
+      <w:kern w:val="28"/>
+      <w:sz w:val="56"/>
+      <w:szCs w:val="56"/>
+    </w:rPr>
+  </w:style>
+  <w:style w:type="paragraph" w:styleId="Subtitle">
+    <w:name w:val="Subtitle"/>
+    <w:basedOn w:val="Normal"/>
+    <w:next w:val="Normal"/>
+    <w:uiPriority w:val="11"/>
+    <w:qFormat/>
+    <w:pPr>
+      <w:keepNext/>
+      <w:spacing w:before="0" w:after="240"/>
+    </w:pPr>
+    <w:rPr>
+      <w:color w:val="3F64D7"/>
+      <w:sz w:val="25"/>
+      <w:szCs w:val="25"/>
+    </w:rPr>
+  </w:style>
   <w:style w:type="character" w:styleId="DefaultParagraphFont" w:default="true">
     <w:name w:val="Default Paragraph Font"/>
     <w:uiPriority w:val="1"/>
@@ -10900,12 +11053,15 @@
     <w:basedOn w:val="DefaultParagraphFont"/>
     <w:link w:val="Heading1"/>
     <w:uiPriority w:val="9"/>
-    <w:rsid w:val="00700ED2"/>
+    <w:semiHidden/>
+    <w:unhideWhenUsed/>
     <w:rPr>
-      <w:rFonts w:asciiTheme="majorHAnsi" w:hAnsiTheme="majorHAnsi" w:eastAsiaTheme="majorEastAsia" w:cstheme="majorBidi"/>
-      <w:color w:val="2F5496" w:themeColor="accent1" w:themeShade="BF"/>
-      <w:sz w:val="32"/>
-      <w:szCs w:val="32"/>
+      <w:rFonts w:asciiTheme="minorHAnsi" w:hAnsiTheme="minorHAnsi" w:eastAsiaTheme="minorEastAsia" w:cstheme="minorBidi"/>
+      <w:b/>
+      <w:bCs/>
+      <w:color w:val="1B2433"/>
+      <w:sz w:val="40"/>
+      <w:szCs w:val="40"/>
     </w:rPr>
   </w:style>
   <w:style w:type="character" w:styleId="Heading2Char" w:customStyle="true">
@@ -10914,12 +11070,14 @@
     <w:link w:val="Heading2"/>
     <w:uiPriority w:val="9"/>
     <w:semiHidden/>
-    <w:rsid w:val="00700ED2"/>
+    <w:unhideWhenUsed/>
     <w:rPr>
-      <w:rFonts w:asciiTheme="majorHAnsi" w:hAnsiTheme="majorHAnsi" w:eastAsiaTheme="majorEastAsia" w:cstheme="majorBidi"/>
-      <w:color w:val="2F5496" w:themeColor="accent1" w:themeShade="BF"/>
-      <w:sz w:val="26"/>
-      <w:szCs w:val="26"/>
+      <w:rFonts w:asciiTheme="minorHAnsi" w:hAnsiTheme="minorHAnsi" w:eastAsiaTheme="minorEastAsia" w:cstheme="minorBidi"/>
+      <w:b/>
+      <w:bCs/>
+      <w:color w:val="1B2433"/>
+      <w:sz w:val="30"/>
+      <w:szCs w:val="30"/>
     </w:rPr>
   </w:style>
   <w:style w:type="character" w:styleId="Heading3Char" w:customStyle="true">
@@ -10928,12 +11086,14 @@
     <w:link w:val="Heading3"/>
     <w:uiPriority w:val="9"/>
     <w:semiHidden/>
-    <w:rsid w:val="00700ED2"/>
+    <w:unhideWhenUsed/>
     <w:rPr>
-      <w:rFonts w:asciiTheme="majorHAnsi" w:hAnsiTheme="majorHAnsi" w:eastAsiaTheme="majorEastAsia" w:cstheme="majorBidi"/>
-      <w:color w:val="1F3763" w:themeColor="accent1" w:themeShade="7F"/>
-      <w:sz w:val="24"/>
-      <w:szCs w:val="24"/>
+      <w:rFonts w:asciiTheme="minorHAnsi" w:hAnsiTheme="minorHAnsi" w:eastAsiaTheme="minorEastAsia" w:cstheme="minorBidi"/>
+      <w:b/>
+      <w:bCs/>
+      <w:color w:val="1B2433"/>
+      <w:sz w:val="25"/>
+      <w:szCs w:val="25"/>
     </w:rPr>
   </w:style>
   <w:style w:type="character" w:styleId="Heading4Char" w:customStyle="true">
@@ -10942,12 +11102,14 @@
     <w:link w:val="Heading4"/>
     <w:uiPriority w:val="9"/>
     <w:semiHidden/>
-    <w:rsid w:val="00700ED2"/>
+    <w:unhideWhenUsed/>
     <w:rPr>
-      <w:rFonts w:asciiTheme="majorHAnsi" w:hAnsiTheme="majorHAnsi" w:eastAsiaTheme="majorEastAsia" w:cstheme="majorBidi"/>
-      <w:i/>
-      <w:iCs/>
-      <w:color w:val="2F5496" w:themeColor="accent1" w:themeShade="BF"/>
+      <w:rFonts w:asciiTheme="minorHAnsi" w:hAnsiTheme="minorHAnsi" w:eastAsiaTheme="minorEastAsia" w:cstheme="minorBidi"/>
+      <w:b/>
+      <w:bCs/>
+      <w:color w:val="1B2433"/>
+      <w:sz w:val="22"/>
+      <w:szCs w:val="22"/>
     </w:rPr>
   </w:style>
   <w:style w:type="character" w:styleId="Heading5Char" w:customStyle="true">
@@ -10956,10 +11118,14 @@
     <w:link w:val="Heading5"/>
     <w:uiPriority w:val="9"/>
     <w:semiHidden/>
-    <w:rsid w:val="00700ED2"/>
+    <w:unhideWhenUsed/>
     <w:rPr>
-      <w:rFonts w:asciiTheme="majorHAnsi" w:hAnsiTheme="majorHAnsi" w:eastAsiaTheme="majorEastAsia" w:cstheme="majorBidi"/>
-      <w:color w:val="2F5496" w:themeColor="accent1" w:themeShade="BF"/>
+      <w:rFonts w:asciiTheme="minorHAnsi" w:hAnsiTheme="minorHAnsi" w:eastAsiaTheme="minorEastAsia" w:cstheme="minorBidi"/>
+      <w:b/>
+      <w:bCs/>
+      <w:color w:val="1B2433"/>
+      <w:sz w:val="22"/>
+      <w:szCs w:val="22"/>
     </w:rPr>
   </w:style>
   <w:style w:type="character" w:styleId="Heading6Char" w:customStyle="true">
@@ -10968,10 +11134,14 @@
     <w:link w:val="Heading6"/>
     <w:uiPriority w:val="9"/>
     <w:semiHidden/>
-    <w:rsid w:val="00700ED2"/>
+    <w:unhideWhenUsed/>
     <w:rPr>
-      <w:rFonts w:asciiTheme="majorHAnsi" w:hAnsiTheme="majorHAnsi" w:eastAsiaTheme="majorEastAsia" w:cstheme="majorBidi"/>
-      <w:color w:val="1F3763" w:themeColor="accent1" w:themeShade="7F"/>
+      <w:rFonts w:asciiTheme="minorHAnsi" w:hAnsiTheme="minorHAnsi" w:eastAsiaTheme="minorEastAsia" w:cstheme="minorBidi"/>
+      <w:b/>
+      <w:bCs/>
+      <w:color w:val="1B2433"/>
+      <w:sz w:val="20"/>
+      <w:szCs w:val="20"/>
     </w:rPr>
   </w:style>
   <w:style w:type="character" w:styleId="Heading7Char" w:customStyle="true">
@@ -11145,6 +11315,151 @@
     <w:rPr>
       <w:vertAlign w:val="superscript"/>
     </w:rPr>
+  </w:style>
+  <w:style w:type="paragraph" w:styleId="TOCHeading">
+    <w:name w:val="TOC Heading"/>
+    <w:basedOn w:val="Heading1"/>
+    <w:next w:val="Normal"/>
+    <w:uiPriority w:val="39"/>
+    <w:unhideWhenUsed/>
+    <w:qFormat/>
+    <w:pPr>
+      <w:outlineLvl w:val="9"/>
+    </w:pPr>
+  </w:style>
+  <w:style w:type="paragraph" w:styleId="TOC1">
+    <w:name w:val="toc 1"/>
+    <w:basedOn w:val="Normal"/>
+    <w:next w:val="Normal"/>
+    <w:autoRedefine/>
+    <w:uiPriority w:val="39"/>
+    <w:unhideWhenUsed/>
+    <w:pPr>
+      <w:tabs>
+        <w:tab w:val="right" w:leader="dot" w:pos="9350"/>
+      </w:tabs>
+      <w:spacing w:after="100"/>
+    </w:pPr>
+  </w:style>
+  <w:style w:type="paragraph" w:styleId="TOC2">
+    <w:name w:val="toc 2"/>
+    <w:basedOn w:val="Normal"/>
+    <w:next w:val="Normal"/>
+    <w:autoRedefine/>
+    <w:uiPriority w:val="39"/>
+    <w:unhideWhenUsed/>
+    <w:pPr>
+      <w:tabs>
+        <w:tab w:val="right" w:leader="dot" w:pos="9350"/>
+      </w:tabs>
+      <w:spacing w:after="100"/>
+      <w:ind w:left="220"/>
+    </w:pPr>
+  </w:style>
+  <w:style w:type="paragraph" w:styleId="TOC3">
+    <w:name w:val="toc 3"/>
+    <w:basedOn w:val="Normal"/>
+    <w:next w:val="Normal"/>
+    <w:autoRedefine/>
+    <w:uiPriority w:val="39"/>
+    <w:unhideWhenUsed/>
+    <w:pPr>
+      <w:tabs>
+        <w:tab w:val="right" w:leader="dot" w:pos="9350"/>
+      </w:tabs>
+      <w:spacing w:after="100"/>
+      <w:ind w:left="440"/>
+    </w:pPr>
+  </w:style>
+  <w:style w:type="paragraph" w:styleId="TOC4">
+    <w:name w:val="toc 4"/>
+    <w:basedOn w:val="Normal"/>
+    <w:next w:val="Normal"/>
+    <w:autoRedefine/>
+    <w:uiPriority w:val="39"/>
+    <w:unhideWhenUsed/>
+    <w:pPr>
+      <w:tabs>
+        <w:tab w:val="right" w:leader="dot" w:pos="9350"/>
+      </w:tabs>
+      <w:spacing w:after="100"/>
+      <w:ind w:left="660"/>
+    </w:pPr>
+  </w:style>
+  <w:style w:type="paragraph" w:styleId="TOC5">
+    <w:name w:val="toc 5"/>
+    <w:basedOn w:val="Normal"/>
+    <w:next w:val="Normal"/>
+    <w:autoRedefine/>
+    <w:uiPriority w:val="39"/>
+    <w:unhideWhenUsed/>
+    <w:pPr>
+      <w:tabs>
+        <w:tab w:val="right" w:leader="dot" w:pos="9350"/>
+      </w:tabs>
+      <w:spacing w:after="100"/>
+      <w:ind w:left="880"/>
+    </w:pPr>
+  </w:style>
+  <w:style w:type="paragraph" w:styleId="TOC6">
+    <w:name w:val="toc 6"/>
+    <w:basedOn w:val="Normal"/>
+    <w:next w:val="Normal"/>
+    <w:autoRedefine/>
+    <w:uiPriority w:val="39"/>
+    <w:unhideWhenUsed/>
+    <w:pPr>
+      <w:tabs>
+        <w:tab w:val="right" w:leader="dot" w:pos="9350"/>
+      </w:tabs>
+      <w:spacing w:after="100"/>
+      <w:ind w:left="1100"/>
+    </w:pPr>
+  </w:style>
+  <w:style w:type="paragraph" w:styleId="TOC7">
+    <w:name w:val="toc 7"/>
+    <w:basedOn w:val="Normal"/>
+    <w:next w:val="Normal"/>
+    <w:autoRedefine/>
+    <w:uiPriority w:val="39"/>
+    <w:unhideWhenUsed/>
+    <w:pPr>
+      <w:tabs>
+        <w:tab w:val="right" w:leader="dot" w:pos="9350"/>
+      </w:tabs>
+      <w:spacing w:after="100"/>
+      <w:ind w:left="1320"/>
+    </w:pPr>
+  </w:style>
+  <w:style w:type="paragraph" w:styleId="TOC8">
+    <w:name w:val="toc 8"/>
+    <w:basedOn w:val="Normal"/>
+    <w:next w:val="Normal"/>
+    <w:autoRedefine/>
+    <w:uiPriority w:val="39"/>
+    <w:unhideWhenUsed/>
+    <w:pPr>
+      <w:tabs>
+        <w:tab w:val="right" w:leader="dot" w:pos="9350"/>
+      </w:tabs>
+      <w:spacing w:after="100"/>
+      <w:ind w:left="1540"/>
+    </w:pPr>
+  </w:style>
+  <w:style w:type="paragraph" w:styleId="TOC9">
+    <w:name w:val="toc 9"/>
+    <w:basedOn w:val="Normal"/>
+    <w:next w:val="Normal"/>
+    <w:autoRedefine/>
+    <w:uiPriority w:val="39"/>
+    <w:unhideWhenUsed/>
+    <w:pPr>
+      <w:tabs>
+        <w:tab w:val="right" w:leader="dot" w:pos="9350"/>
+      </w:tabs>
+      <w:spacing w:after="100"/>
+      <w:ind w:left="1760"/>
+    </w:pPr>
   </w:style>
 </w:styles>
 </file>
@@ -11192,7 +11507,7 @@
     </a:clrScheme>
     <a:fontScheme name="Office">
       <a:majorFont>
-        <a:latin typeface="Calibri Light" panose="020F0302020204030204"/>
+        <a:latin typeface="Aptos"/>
         <a:ea typeface=""/>
         <a:cs typeface=""/>
         <a:font script="Jpan" typeface="游ゴシック Light"/>
@@ -11244,7 +11559,7 @@
         <a:font script="Tfng" typeface="Ebrima"/>
       </a:majorFont>
       <a:minorFont>
-        <a:latin typeface="Calibri" panose="020F0502020204030204"/>
+        <a:latin typeface="Aptos"/>
         <a:ea typeface=""/>
         <a:cs typeface=""/>
         <a:font script="Jpan" typeface="游明朝"/>

</xml_diff>